<commit_message>
feat(enh041): docx AI-native generation + Mermaid diagrams → 2.8.0 (phase 70)
- workflows/proposal.md: Step 4b generate_docx_content (independent AI pass,
  docxContent JSON schema); Step 7 consumes docxContent; Step 8 embeds Mermaid
  fenced blocks in .md companion
- lib/proposal-generator.cjs: getDiagramTypes(typeId) exported helper
- scripts/gen-proposal-docx.cjs: riskRegisterTable() + glossaryTable(); 12
  sections (added §8 Risk Register, §11 Glossary)
- templates/proposal/docx/project-detail.docx: regenerated
- tests: vp-enh041-proposal-docx-ai.test.js (17 tests); contracts +5 (717/717)

Co-Authored-By: Claude Sonnet 4.6 <noreply@anthropic.com>
</commit_message>
<xml_diff>
--- a/templates/proposal/docx/project-detail.docx
+++ b/templates/proposal/docx/project-detail.docx
@@ -2296,12 +2296,571 @@
       </w:pPr>
     </w:p>
     <w:p>
+      <w:r>
+        <w:br w:type="page"/>
+      </w:r>
+    </w:p>
+    <w:p>
       <w:pPr>
         <w:pStyle w:val="Heading1"/>
         <w:spacing w:after="200" w:before="480"/>
       </w:pPr>
       <w:r>
-        <w:t xml:space="preserve">8. Why Choose Us</w:t>
+        <w:t xml:space="preserve">8. Risk Register</w:t>
+      </w:r>
+    </w:p>
+    <w:p>
+      <w:pPr>
+        <w:spacing w:after="80" w:before="80"/>
+      </w:pPr>
+      <w:r>
+        <w:t xml:space="preserve">The following table summarises key project risks, their likelihood and impact, and the planned mitigation strategies.</w:t>
+      </w:r>
+    </w:p>
+    <w:p>
+      <w:pPr>
+        <w:spacing w:after="100" w:before="100"/>
+      </w:pPr>
+    </w:p>
+    <w:tbl>
+      <w:tblPr>
+        <w:tblW w:type="pct" w:w="100%"/>
+        <w:tblBorders>
+          <w:top w:val="single" w:color="auto" w:sz="4"/>
+          <w:left w:val="single" w:color="auto" w:sz="4"/>
+          <w:bottom w:val="single" w:color="auto" w:sz="4"/>
+          <w:right w:val="single" w:color="auto" w:sz="4"/>
+          <w:insideH w:val="single" w:color="auto" w:sz="4"/>
+          <w:insideV w:val="single" w:color="auto" w:sz="4"/>
+        </w:tblBorders>
+      </w:tblPr>
+      <w:tblGrid>
+        <w:gridCol w:w="100"/>
+        <w:gridCol w:w="100"/>
+        <w:gridCol w:w="100"/>
+        <w:gridCol w:w="100"/>
+      </w:tblGrid>
+      <w:tr>
+        <w:trPr>
+          <w:tblHeader/>
+        </w:trPr>
+        <w:tc>
+          <w:tcPr>
+            <w:tcW w:type="pct" w:w="35%"/>
+            <w:shd w:fill="D8DCF0" w:color="auto" w:val="clear"/>
+            <w:vAlign w:val="center"/>
+          </w:tcPr>
+          <w:p>
+            <w:pPr>
+              <w:spacing w:after="60" w:before="60"/>
+            </w:pPr>
+            <w:r>
+              <w:rPr>
+                <w:b/>
+                <w:bCs/>
+                <w:color w:val="1a1f36"/>
+                <w:sz w:val="20"/>
+                <w:szCs w:val="20"/>
+              </w:rPr>
+              <w:t xml:space="preserve">Risk</w:t>
+            </w:r>
+          </w:p>
+        </w:tc>
+        <w:tc>
+          <w:tcPr>
+            <w:tcW w:type="pct" w:w="15%"/>
+            <w:shd w:fill="D8DCF0" w:color="auto" w:val="clear"/>
+            <w:vAlign w:val="center"/>
+          </w:tcPr>
+          <w:p>
+            <w:pPr>
+              <w:spacing w:after="60" w:before="60"/>
+            </w:pPr>
+            <w:r>
+              <w:rPr>
+                <w:b/>
+                <w:bCs/>
+                <w:color w:val="1a1f36"/>
+                <w:sz w:val="20"/>
+                <w:szCs w:val="20"/>
+              </w:rPr>
+              <w:t xml:space="preserve">Probability</w:t>
+            </w:r>
+          </w:p>
+        </w:tc>
+        <w:tc>
+          <w:tcPr>
+            <w:tcW w:type="pct" w:w="15%"/>
+            <w:shd w:fill="D8DCF0" w:color="auto" w:val="clear"/>
+            <w:vAlign w:val="center"/>
+          </w:tcPr>
+          <w:p>
+            <w:pPr>
+              <w:spacing w:after="60" w:before="60"/>
+            </w:pPr>
+            <w:r>
+              <w:rPr>
+                <w:b/>
+                <w:bCs/>
+                <w:color w:val="1a1f36"/>
+                <w:sz w:val="20"/>
+                <w:szCs w:val="20"/>
+              </w:rPr>
+              <w:t xml:space="preserve">Impact</w:t>
+            </w:r>
+          </w:p>
+        </w:tc>
+        <w:tc>
+          <w:tcPr>
+            <w:tcW w:type="pct" w:w="35%"/>
+            <w:shd w:fill="D8DCF0" w:color="auto" w:val="clear"/>
+            <w:vAlign w:val="center"/>
+          </w:tcPr>
+          <w:p>
+            <w:pPr>
+              <w:spacing w:after="60" w:before="60"/>
+            </w:pPr>
+            <w:r>
+              <w:rPr>
+                <w:b/>
+                <w:bCs/>
+                <w:color w:val="1a1f36"/>
+                <w:sz w:val="20"/>
+                <w:szCs w:val="20"/>
+              </w:rPr>
+              <w:t xml:space="preserve">Mitigation</w:t>
+            </w:r>
+          </w:p>
+        </w:tc>
+      </w:tr>
+      <w:tr>
+        <w:tc>
+          <w:tcPr>
+            <w:tcW w:type="pct" w:w="35%"/>
+          </w:tcPr>
+          <w:p>
+            <w:pPr>
+              <w:spacing w:after="80" w:before="80"/>
+            </w:pPr>
+            <w:r>
+              <w:rPr>
+                <w:b w:val="false"/>
+                <w:bCs w:val="false"/>
+                <w:i/>
+                <w:iCs/>
+                <w:color w:val="8892b0"/>
+              </w:rPr>
+              <w:t xml:space="preserve">{{Requirements scope creep}}</w:t>
+            </w:r>
+          </w:p>
+        </w:tc>
+        <w:tc>
+          <w:tcPr>
+            <w:tcW w:type="pct" w:w="15%"/>
+          </w:tcPr>
+          <w:p>
+            <w:pPr>
+              <w:spacing w:after="80" w:before="80"/>
+            </w:pPr>
+            <w:r>
+              <w:rPr>
+                <w:b w:val="false"/>
+                <w:bCs w:val="false"/>
+                <w:i/>
+                <w:iCs/>
+                <w:color w:val="8892b0"/>
+              </w:rPr>
+              <w:t xml:space="preserve">{{probability: High|Med|Low}}</w:t>
+            </w:r>
+          </w:p>
+        </w:tc>
+        <w:tc>
+          <w:tcPr>
+            <w:tcW w:type="pct" w:w="15%"/>
+          </w:tcPr>
+          <w:p>
+            <w:pPr>
+              <w:spacing w:after="80" w:before="80"/>
+            </w:pPr>
+            <w:r>
+              <w:rPr>
+                <w:b w:val="false"/>
+                <w:bCs w:val="false"/>
+                <w:i/>
+                <w:iCs/>
+                <w:color w:val="8892b0"/>
+              </w:rPr>
+              <w:t xml:space="preserve">{{impact: High|Med|Low}}</w:t>
+            </w:r>
+          </w:p>
+        </w:tc>
+        <w:tc>
+          <w:tcPr>
+            <w:tcW w:type="pct" w:w="35%"/>
+          </w:tcPr>
+          <w:p>
+            <w:pPr>
+              <w:spacing w:after="80" w:before="80"/>
+            </w:pPr>
+            <w:r>
+              <w:rPr>
+                <w:b w:val="false"/>
+                <w:bCs w:val="false"/>
+                <w:i/>
+                <w:iCs/>
+                <w:color w:val="8892b0"/>
+              </w:rPr>
+              <w:t xml:space="preserve">{{mitigation strategy — who owns it and how it is managed}}</w:t>
+            </w:r>
+          </w:p>
+        </w:tc>
+      </w:tr>
+      <w:tr>
+        <w:tc>
+          <w:tcPr>
+            <w:tcW w:type="pct" w:w="35%"/>
+          </w:tcPr>
+          <w:p>
+            <w:pPr>
+              <w:spacing w:after="80" w:before="80"/>
+            </w:pPr>
+            <w:r>
+              <w:rPr>
+                <w:b w:val="false"/>
+                <w:bCs w:val="false"/>
+                <w:i/>
+                <w:iCs/>
+                <w:color w:val="8892b0"/>
+              </w:rPr>
+              <w:t xml:space="preserve">{{Key resource unavailability}}</w:t>
+            </w:r>
+          </w:p>
+        </w:tc>
+        <w:tc>
+          <w:tcPr>
+            <w:tcW w:type="pct" w:w="15%"/>
+          </w:tcPr>
+          <w:p>
+            <w:pPr>
+              <w:spacing w:after="80" w:before="80"/>
+            </w:pPr>
+            <w:r>
+              <w:rPr>
+                <w:b w:val="false"/>
+                <w:bCs w:val="false"/>
+                <w:i/>
+                <w:iCs/>
+                <w:color w:val="8892b0"/>
+              </w:rPr>
+              <w:t xml:space="preserve">{{probability: High|Med|Low}}</w:t>
+            </w:r>
+          </w:p>
+        </w:tc>
+        <w:tc>
+          <w:tcPr>
+            <w:tcW w:type="pct" w:w="15%"/>
+          </w:tcPr>
+          <w:p>
+            <w:pPr>
+              <w:spacing w:after="80" w:before="80"/>
+            </w:pPr>
+            <w:r>
+              <w:rPr>
+                <w:b w:val="false"/>
+                <w:bCs w:val="false"/>
+                <w:i/>
+                <w:iCs/>
+                <w:color w:val="8892b0"/>
+              </w:rPr>
+              <w:t xml:space="preserve">{{impact: High|Med|Low}}</w:t>
+            </w:r>
+          </w:p>
+        </w:tc>
+        <w:tc>
+          <w:tcPr>
+            <w:tcW w:type="pct" w:w="35%"/>
+          </w:tcPr>
+          <w:p>
+            <w:pPr>
+              <w:spacing w:after="80" w:before="80"/>
+            </w:pPr>
+            <w:r>
+              <w:rPr>
+                <w:b w:val="false"/>
+                <w:bCs w:val="false"/>
+                <w:i/>
+                <w:iCs/>
+                <w:color w:val="8892b0"/>
+              </w:rPr>
+              <w:t xml:space="preserve">{{mitigation strategy}}</w:t>
+            </w:r>
+          </w:p>
+        </w:tc>
+      </w:tr>
+      <w:tr>
+        <w:tc>
+          <w:tcPr>
+            <w:tcW w:type="pct" w:w="35%"/>
+          </w:tcPr>
+          <w:p>
+            <w:pPr>
+              <w:spacing w:after="80" w:before="80"/>
+            </w:pPr>
+            <w:r>
+              <w:rPr>
+                <w:b w:val="false"/>
+                <w:bCs w:val="false"/>
+                <w:i/>
+                <w:iCs/>
+                <w:color w:val="8892b0"/>
+              </w:rPr>
+              <w:t xml:space="preserve">{{Third-party API or integration delays}}</w:t>
+            </w:r>
+          </w:p>
+        </w:tc>
+        <w:tc>
+          <w:tcPr>
+            <w:tcW w:type="pct" w:w="15%"/>
+          </w:tcPr>
+          <w:p>
+            <w:pPr>
+              <w:spacing w:after="80" w:before="80"/>
+            </w:pPr>
+            <w:r>
+              <w:rPr>
+                <w:b w:val="false"/>
+                <w:bCs w:val="false"/>
+                <w:i/>
+                <w:iCs/>
+                <w:color w:val="8892b0"/>
+              </w:rPr>
+              <w:t xml:space="preserve">{{probability: High|Med|Low}}</w:t>
+            </w:r>
+          </w:p>
+        </w:tc>
+        <w:tc>
+          <w:tcPr>
+            <w:tcW w:type="pct" w:w="15%"/>
+          </w:tcPr>
+          <w:p>
+            <w:pPr>
+              <w:spacing w:after="80" w:before="80"/>
+            </w:pPr>
+            <w:r>
+              <w:rPr>
+                <w:b w:val="false"/>
+                <w:bCs w:val="false"/>
+                <w:i/>
+                <w:iCs/>
+                <w:color w:val="8892b0"/>
+              </w:rPr>
+              <w:t xml:space="preserve">{{impact: High|Med|Low}}</w:t>
+            </w:r>
+          </w:p>
+        </w:tc>
+        <w:tc>
+          <w:tcPr>
+            <w:tcW w:type="pct" w:w="35%"/>
+          </w:tcPr>
+          <w:p>
+            <w:pPr>
+              <w:spacing w:after="80" w:before="80"/>
+            </w:pPr>
+            <w:r>
+              <w:rPr>
+                <w:b w:val="false"/>
+                <w:bCs w:val="false"/>
+                <w:i/>
+                <w:iCs/>
+                <w:color w:val="8892b0"/>
+              </w:rPr>
+              <w:t xml:space="preserve">{{mitigation strategy}}</w:t>
+            </w:r>
+          </w:p>
+        </w:tc>
+      </w:tr>
+      <w:tr>
+        <w:tc>
+          <w:tcPr>
+            <w:tcW w:type="pct" w:w="35%"/>
+          </w:tcPr>
+          <w:p>
+            <w:pPr>
+              <w:spacing w:after="80" w:before="80"/>
+            </w:pPr>
+            <w:r>
+              <w:rPr>
+                <w:b w:val="false"/>
+                <w:bCs w:val="false"/>
+                <w:i/>
+                <w:iCs/>
+                <w:color w:val="8892b0"/>
+              </w:rPr>
+              <w:t xml:space="preserve">{{Performance under peak load}}</w:t>
+            </w:r>
+          </w:p>
+        </w:tc>
+        <w:tc>
+          <w:tcPr>
+            <w:tcW w:type="pct" w:w="15%"/>
+          </w:tcPr>
+          <w:p>
+            <w:pPr>
+              <w:spacing w:after="80" w:before="80"/>
+            </w:pPr>
+            <w:r>
+              <w:rPr>
+                <w:b w:val="false"/>
+                <w:bCs w:val="false"/>
+                <w:i/>
+                <w:iCs/>
+                <w:color w:val="8892b0"/>
+              </w:rPr>
+              <w:t xml:space="preserve">{{probability: High|Med|Low}}</w:t>
+            </w:r>
+          </w:p>
+        </w:tc>
+        <w:tc>
+          <w:tcPr>
+            <w:tcW w:type="pct" w:w="15%"/>
+          </w:tcPr>
+          <w:p>
+            <w:pPr>
+              <w:spacing w:after="80" w:before="80"/>
+            </w:pPr>
+            <w:r>
+              <w:rPr>
+                <w:b w:val="false"/>
+                <w:bCs w:val="false"/>
+                <w:i/>
+                <w:iCs/>
+                <w:color w:val="8892b0"/>
+              </w:rPr>
+              <w:t xml:space="preserve">{{impact: High|Med|Low}}</w:t>
+            </w:r>
+          </w:p>
+        </w:tc>
+        <w:tc>
+          <w:tcPr>
+            <w:tcW w:type="pct" w:w="35%"/>
+          </w:tcPr>
+          <w:p>
+            <w:pPr>
+              <w:spacing w:after="80" w:before="80"/>
+            </w:pPr>
+            <w:r>
+              <w:rPr>
+                <w:b w:val="false"/>
+                <w:bCs w:val="false"/>
+                <w:i/>
+                <w:iCs/>
+                <w:color w:val="8892b0"/>
+              </w:rPr>
+              <w:t xml:space="preserve">{{mitigation strategy}}</w:t>
+            </w:r>
+          </w:p>
+        </w:tc>
+      </w:tr>
+      <w:tr>
+        <w:tc>
+          <w:tcPr>
+            <w:tcW w:type="pct" w:w="35%"/>
+          </w:tcPr>
+          <w:p>
+            <w:pPr>
+              <w:spacing w:after="80" w:before="80"/>
+            </w:pPr>
+            <w:r>
+              <w:rPr>
+                <w:b w:val="false"/>
+                <w:bCs w:val="false"/>
+                <w:i/>
+                <w:iCs/>
+                <w:color w:val="8892b0"/>
+              </w:rPr>
+              <w:t xml:space="preserve">{{Security vulnerability in dependencies}}</w:t>
+            </w:r>
+          </w:p>
+        </w:tc>
+        <w:tc>
+          <w:tcPr>
+            <w:tcW w:type="pct" w:w="15%"/>
+          </w:tcPr>
+          <w:p>
+            <w:pPr>
+              <w:spacing w:after="80" w:before="80"/>
+            </w:pPr>
+            <w:r>
+              <w:rPr>
+                <w:b w:val="false"/>
+                <w:bCs w:val="false"/>
+                <w:i/>
+                <w:iCs/>
+                <w:color w:val="8892b0"/>
+              </w:rPr>
+              <w:t xml:space="preserve">{{probability: High|Med|Low}}</w:t>
+            </w:r>
+          </w:p>
+        </w:tc>
+        <w:tc>
+          <w:tcPr>
+            <w:tcW w:type="pct" w:w="15%"/>
+          </w:tcPr>
+          <w:p>
+            <w:pPr>
+              <w:spacing w:after="80" w:before="80"/>
+            </w:pPr>
+            <w:r>
+              <w:rPr>
+                <w:b w:val="false"/>
+                <w:bCs w:val="false"/>
+                <w:i/>
+                <w:iCs/>
+                <w:color w:val="8892b0"/>
+              </w:rPr>
+              <w:t xml:space="preserve">{{impact: High|Med|Low}}</w:t>
+            </w:r>
+          </w:p>
+        </w:tc>
+        <w:tc>
+          <w:tcPr>
+            <w:tcW w:type="pct" w:w="35%"/>
+          </w:tcPr>
+          <w:p>
+            <w:pPr>
+              <w:spacing w:after="80" w:before="80"/>
+            </w:pPr>
+            <w:r>
+              <w:rPr>
+                <w:b w:val="false"/>
+                <w:bCs w:val="false"/>
+                <w:i/>
+                <w:iCs/>
+                <w:color w:val="8892b0"/>
+              </w:rPr>
+              <w:t xml:space="preserve">{{mitigation strategy}}</w:t>
+            </w:r>
+          </w:p>
+        </w:tc>
+      </w:tr>
+    </w:tbl>
+    <w:p>
+      <w:pPr>
+        <w:spacing w:after="100" w:before="100"/>
+      </w:pPr>
+    </w:p>
+    <w:p>
+      <w:r>
+        <w:br w:type="page"/>
+      </w:r>
+    </w:p>
+    <w:p>
+      <w:pPr>
+        <w:pStyle w:val="Heading1"/>
+        <w:spacing w:after="200" w:before="480"/>
+      </w:pPr>
+      <w:r>
+        <w:t xml:space="preserve">9. Why Choose Us</w:t>
       </w:r>
     </w:p>
     <w:p>
@@ -2360,7 +2919,7 @@
         <w:spacing w:after="200" w:before="480"/>
       </w:pPr>
       <w:r>
-        <w:t xml:space="preserve">9. Next Steps</w:t>
+        <w:t xml:space="preserve">10. Next Steps</w:t>
       </w:r>
     </w:p>
     <w:p>
@@ -2441,7 +3000,281 @@
         <w:spacing w:after="200" w:before="480"/>
       </w:pPr>
       <w:r>
-        <w:t xml:space="preserve">10. Appendix</w:t>
+        <w:t xml:space="preserve">11. Glossary</w:t>
+      </w:r>
+    </w:p>
+    <w:p>
+      <w:pPr>
+        <w:spacing w:after="80" w:before="80"/>
+      </w:pPr>
+      <w:r>
+        <w:t xml:space="preserve">Definitions of key terms and acronyms used in this proposal.</w:t>
+      </w:r>
+    </w:p>
+    <w:p>
+      <w:pPr>
+        <w:spacing w:after="100" w:before="100"/>
+      </w:pPr>
+    </w:p>
+    <w:tbl>
+      <w:tblPr>
+        <w:tblW w:type="pct" w:w="100%"/>
+        <w:tblBorders>
+          <w:top w:val="single" w:color="auto" w:sz="4"/>
+          <w:left w:val="single" w:color="auto" w:sz="4"/>
+          <w:bottom w:val="single" w:color="auto" w:sz="4"/>
+          <w:right w:val="single" w:color="auto" w:sz="4"/>
+          <w:insideH w:val="single" w:color="auto" w:sz="4"/>
+          <w:insideV w:val="single" w:color="auto" w:sz="4"/>
+        </w:tblBorders>
+      </w:tblPr>
+      <w:tblGrid>
+        <w:gridCol w:w="100"/>
+        <w:gridCol w:w="100"/>
+      </w:tblGrid>
+      <w:tr>
+        <w:trPr>
+          <w:tblHeader/>
+        </w:trPr>
+        <w:tc>
+          <w:tcPr>
+            <w:tcW w:type="pct" w:w="30%"/>
+            <w:shd w:fill="D8DCF0" w:color="auto" w:val="clear"/>
+            <w:vAlign w:val="center"/>
+          </w:tcPr>
+          <w:p>
+            <w:pPr>
+              <w:spacing w:after="60" w:before="60"/>
+            </w:pPr>
+            <w:r>
+              <w:rPr>
+                <w:b/>
+                <w:bCs/>
+                <w:color w:val="1a1f36"/>
+                <w:sz w:val="20"/>
+                <w:szCs w:val="20"/>
+              </w:rPr>
+              <w:t xml:space="preserve">Term</w:t>
+            </w:r>
+          </w:p>
+        </w:tc>
+        <w:tc>
+          <w:tcPr>
+            <w:tcW w:type="pct" w:w="70%"/>
+            <w:shd w:fill="D8DCF0" w:color="auto" w:val="clear"/>
+            <w:vAlign w:val="center"/>
+          </w:tcPr>
+          <w:p>
+            <w:pPr>
+              <w:spacing w:after="60" w:before="60"/>
+            </w:pPr>
+            <w:r>
+              <w:rPr>
+                <w:b/>
+                <w:bCs/>
+                <w:color w:val="1a1f36"/>
+                <w:sz w:val="20"/>
+                <w:szCs w:val="20"/>
+              </w:rPr>
+              <w:t xml:space="preserve">Definition</w:t>
+            </w:r>
+          </w:p>
+        </w:tc>
+      </w:tr>
+      <w:tr>
+        <w:tc>
+          <w:tcPr>
+            <w:tcW w:type="pct" w:w="30%"/>
+          </w:tcPr>
+          <w:p>
+            <w:pPr>
+              <w:spacing w:after="60" w:before="60"/>
+            </w:pPr>
+            <w:r>
+              <w:rPr>
+                <w:b/>
+                <w:bCs/>
+                <w:i w:val="false"/>
+                <w:iCs w:val="false"/>
+                <w:color w:val="1a1f36"/>
+                <w:sz w:val="20"/>
+                <w:szCs w:val="20"/>
+              </w:rPr>
+              <w:t xml:space="preserve">{{Term / Acronym 1}}</w:t>
+            </w:r>
+          </w:p>
+        </w:tc>
+        <w:tc>
+          <w:tcPr>
+            <w:tcW w:type="pct" w:w="70%"/>
+          </w:tcPr>
+          <w:p>
+            <w:pPr>
+              <w:spacing w:after="80" w:before="80"/>
+            </w:pPr>
+            <w:r>
+              <w:rPr>
+                <w:b w:val="false"/>
+                <w:bCs w:val="false"/>
+                <w:i/>
+                <w:iCs/>
+                <w:color w:val="8892b0"/>
+              </w:rPr>
+              <w:t xml:space="preserve">{{plain-language definition — avoid jargon; write for a non-technical decision maker}}</w:t>
+            </w:r>
+          </w:p>
+        </w:tc>
+      </w:tr>
+      <w:tr>
+        <w:tc>
+          <w:tcPr>
+            <w:tcW w:type="pct" w:w="30%"/>
+          </w:tcPr>
+          <w:p>
+            <w:pPr>
+              <w:spacing w:after="60" w:before="60"/>
+            </w:pPr>
+            <w:r>
+              <w:rPr>
+                <w:b/>
+                <w:bCs/>
+                <w:i w:val="false"/>
+                <w:iCs w:val="false"/>
+                <w:color w:val="1a1f36"/>
+                <w:sz w:val="20"/>
+                <w:szCs w:val="20"/>
+              </w:rPr>
+              <w:t xml:space="preserve">{{Term / Acronym 2}}</w:t>
+            </w:r>
+          </w:p>
+        </w:tc>
+        <w:tc>
+          <w:tcPr>
+            <w:tcW w:type="pct" w:w="70%"/>
+          </w:tcPr>
+          <w:p>
+            <w:pPr>
+              <w:spacing w:after="80" w:before="80"/>
+            </w:pPr>
+            <w:r>
+              <w:rPr>
+                <w:b w:val="false"/>
+                <w:bCs w:val="false"/>
+                <w:i/>
+                <w:iCs/>
+                <w:color w:val="8892b0"/>
+              </w:rPr>
+              <w:t xml:space="preserve">{{plain-language definition}}</w:t>
+            </w:r>
+          </w:p>
+        </w:tc>
+      </w:tr>
+      <w:tr>
+        <w:tc>
+          <w:tcPr>
+            <w:tcW w:type="pct" w:w="30%"/>
+          </w:tcPr>
+          <w:p>
+            <w:pPr>
+              <w:spacing w:after="60" w:before="60"/>
+            </w:pPr>
+            <w:r>
+              <w:rPr>
+                <w:b/>
+                <w:bCs/>
+                <w:i w:val="false"/>
+                <w:iCs w:val="false"/>
+                <w:color w:val="1a1f36"/>
+                <w:sz w:val="20"/>
+                <w:szCs w:val="20"/>
+              </w:rPr>
+              <w:t xml:space="preserve">{{Term / Acronym 3}}</w:t>
+            </w:r>
+          </w:p>
+        </w:tc>
+        <w:tc>
+          <w:tcPr>
+            <w:tcW w:type="pct" w:w="70%"/>
+          </w:tcPr>
+          <w:p>
+            <w:pPr>
+              <w:spacing w:after="80" w:before="80"/>
+            </w:pPr>
+            <w:r>
+              <w:rPr>
+                <w:b w:val="false"/>
+                <w:bCs w:val="false"/>
+                <w:i/>
+                <w:iCs/>
+                <w:color w:val="8892b0"/>
+              </w:rPr>
+              <w:t xml:space="preserve">{{plain-language definition}}</w:t>
+            </w:r>
+          </w:p>
+        </w:tc>
+      </w:tr>
+      <w:tr>
+        <w:tc>
+          <w:tcPr>
+            <w:tcW w:type="pct" w:w="30%"/>
+          </w:tcPr>
+          <w:p>
+            <w:pPr>
+              <w:spacing w:after="60" w:before="60"/>
+            </w:pPr>
+            <w:r>
+              <w:rPr>
+                <w:b/>
+                <w:bCs/>
+                <w:i w:val="false"/>
+                <w:iCs w:val="false"/>
+                <w:color w:val="1a1f36"/>
+                <w:sz w:val="20"/>
+                <w:szCs w:val="20"/>
+              </w:rPr>
+              <w:t xml:space="preserve">{{Term / Acronym 4}}</w:t>
+            </w:r>
+          </w:p>
+        </w:tc>
+        <w:tc>
+          <w:tcPr>
+            <w:tcW w:type="pct" w:w="70%"/>
+          </w:tcPr>
+          <w:p>
+            <w:pPr>
+              <w:spacing w:after="80" w:before="80"/>
+            </w:pPr>
+            <w:r>
+              <w:rPr>
+                <w:b w:val="false"/>
+                <w:bCs w:val="false"/>
+                <w:i/>
+                <w:iCs/>
+                <w:color w:val="8892b0"/>
+              </w:rPr>
+              <w:t xml:space="preserve">{{plain-language definition}}</w:t>
+            </w:r>
+          </w:p>
+        </w:tc>
+      </w:tr>
+    </w:tbl>
+    <w:p>
+      <w:pPr>
+        <w:spacing w:after="100" w:before="100"/>
+      </w:pPr>
+    </w:p>
+    <w:p>
+      <w:r>
+        <w:br w:type="page"/>
+      </w:r>
+    </w:p>
+    <w:p>
+      <w:pPr>
+        <w:pStyle w:val="Heading1"/>
+        <w:spacing w:after="200" w:before="480"/>
+      </w:pPr>
+      <w:r>
+        <w:t xml:space="preserve">12. Appendix</w:t>
       </w:r>
     </w:p>
     <w:p>
@@ -2450,7 +3283,7 @@
         <w:spacing w:after="120" w:before="280"/>
       </w:pPr>
       <w:r>
-        <w:t xml:space="preserve">10.1 Brainstorm Session Notes</w:t>
+        <w:t xml:space="preserve">12.1 Brainstorm Session Notes</w:t>
       </w:r>
     </w:p>
     <w:p>
@@ -2479,7 +3312,7 @@
         <w:spacing w:after="120" w:before="280"/>
       </w:pPr>
       <w:r>
-        <w:t xml:space="preserve">10.2 References &amp; Supporting Documents</w:t>
+        <w:t xml:space="preserve">12.2 References &amp; Supporting Documents</w:t>
       </w:r>
     </w:p>
     <w:p>
@@ -2508,7 +3341,7 @@
         <w:spacing w:after="120" w:before="280"/>
       </w:pPr>
       <w:r>
-        <w:t xml:space="preserve">10.3 Assumptions</w:t>
+        <w:t xml:space="preserve">12.3 Assumptions</w:t>
       </w:r>
     </w:p>
     <w:p>

</xml_diff>